<commit_message>
Minor update moving the $objNum calculation after all questions are parsed.
</commit_message>
<xml_diff>
--- a/Next_version.docx
+++ b/Next_version.docx
@@ -1,6 +1,6 @@
 
 <file path=word/document.xml><?xml version="1.0" encoding="utf-8"?>
-<w:document xmlns:wpc="http://schemas.microsoft.com/office/word/2010/wordprocessingCanvas" xmlns:cx="http://schemas.microsoft.com/office/drawing/2014/chartex" xmlns:cx1="http://schemas.microsoft.com/office/drawing/2015/9/8/chartex" xmlns:cx2="http://schemas.microsoft.com/office/drawing/2015/10/21/chartex" xmlns:cx3="http://schemas.microsoft.com/office/drawing/2016/5/9/chartex" xmlns:cx4="http://schemas.microsoft.com/office/drawing/2016/5/10/chartex" xmlns:cx5="http://schemas.microsoft.com/office/drawing/2016/5/11/chartex" xmlns:cx6="http://schemas.microsoft.com/office/drawing/2016/5/12/chartex" xmlns:cx7="http://schemas.microsoft.com/office/drawing/2016/5/13/chartex" xmlns:cx8="http://schemas.microsoft.com/office/drawing/2016/5/14/chartex" xmlns:mc="http://schemas.openxmlformats.org/markup-compatibility/2006" xmlns:aink="http://schemas.microsoft.com/office/drawing/2016/ink" xmlns:am3d="http://schemas.microsoft.com/office/drawing/2017/model3d" xmlns:o="urn:schemas-microsoft-com:office:office" xmlns:oel="http://schemas.microsoft.com/office/2019/extlst" xmlns:r="http://schemas.openxmlformats.org/officeDocument/2006/relationships" xmlns:m="http://schemas.openxmlformats.org/officeDocument/2006/math" xmlns:v="urn:schemas-microsoft-com:vml" xmlns:wp14="http://schemas.microsoft.com/office/word/2010/wordprocessingDrawing" xmlns:wp="http://schemas.openxmlformats.org/drawingml/2006/wordprocessingDrawing" xmlns:w10="urn:schemas-microsoft-com:office:word" xmlns:w="http://schemas.openxmlformats.org/wordprocessingml/2006/main" xmlns:w14="http://schemas.microsoft.com/office/word/2010/wordml" xmlns:w15="http://schemas.microsoft.com/office/word/2012/wordml" xmlns:w16cex="http://schemas.microsoft.com/office/word/2018/wordml/cex" xmlns:w16cid="http://schemas.microsoft.com/office/word/2016/wordml/cid" xmlns:w16="http://schemas.microsoft.com/office/word/2018/wordml" xmlns:w16sdtdh="http://schemas.microsoft.com/office/word/2020/wordml/sdtdatahash" xmlns:w16se="http://schemas.microsoft.com/office/word/2015/wordml/symex" xmlns:wpg="http://schemas.microsoft.com/office/word/2010/wordprocessingGroup" xmlns:wpi="http://schemas.microsoft.com/office/word/2010/wordprocessingInk" xmlns:wne="http://schemas.microsoft.com/office/word/2006/wordml" xmlns:wps="http://schemas.microsoft.com/office/word/2010/wordprocessingShape" mc:Ignorable="w14 w15 w16se w16cid w16 w16cex w16sdtdh wp14">
+<w:document xmlns:wpc="http://schemas.microsoft.com/office/word/2010/wordprocessingCanvas" xmlns:cx="http://schemas.microsoft.com/office/drawing/2014/chartex" xmlns:cx1="http://schemas.microsoft.com/office/drawing/2015/9/8/chartex" xmlns:cx2="http://schemas.microsoft.com/office/drawing/2015/10/21/chartex" xmlns:cx3="http://schemas.microsoft.com/office/drawing/2016/5/9/chartex" xmlns:cx4="http://schemas.microsoft.com/office/drawing/2016/5/10/chartex" xmlns:cx5="http://schemas.microsoft.com/office/drawing/2016/5/11/chartex" xmlns:cx6="http://schemas.microsoft.com/office/drawing/2016/5/12/chartex" xmlns:cx7="http://schemas.microsoft.com/office/drawing/2016/5/13/chartex" xmlns:cx8="http://schemas.microsoft.com/office/drawing/2016/5/14/chartex" xmlns:mc="http://schemas.openxmlformats.org/markup-compatibility/2006" xmlns:aink="http://schemas.microsoft.com/office/drawing/2016/ink" xmlns:am3d="http://schemas.microsoft.com/office/drawing/2017/model3d" xmlns:o="urn:schemas-microsoft-com:office:office" xmlns:oel="http://schemas.microsoft.com/office/2019/extlst" xmlns:r="http://schemas.openxmlformats.org/officeDocument/2006/relationships" xmlns:m="http://schemas.openxmlformats.org/officeDocument/2006/math" xmlns:v="urn:schemas-microsoft-com:vml" xmlns:wp14="http://schemas.microsoft.com/office/word/2010/wordprocessingDrawing" xmlns:wp="http://schemas.openxmlformats.org/drawingml/2006/wordprocessingDrawing" xmlns:w10="urn:schemas-microsoft-com:office:word" xmlns:w="http://schemas.openxmlformats.org/wordprocessingml/2006/main" xmlns:w14="http://schemas.microsoft.com/office/word/2010/wordml" xmlns:w15="http://schemas.microsoft.com/office/word/2012/wordml" xmlns:w16cex="http://schemas.microsoft.com/office/word/2018/wordml/cex" xmlns:w16cid="http://schemas.microsoft.com/office/word/2016/wordml/cid" xmlns:w16="http://schemas.microsoft.com/office/word/2018/wordml" xmlns:w16du="http://schemas.microsoft.com/office/word/2023/wordml/word16du" xmlns:w16sdtdh="http://schemas.microsoft.com/office/word/2020/wordml/sdtdatahash" xmlns:w16se="http://schemas.microsoft.com/office/word/2015/wordml/symex" xmlns:wpg="http://schemas.microsoft.com/office/word/2010/wordprocessingGroup" xmlns:wpi="http://schemas.microsoft.com/office/word/2010/wordprocessingInk" xmlns:wne="http://schemas.microsoft.com/office/word/2006/wordml" xmlns:wps="http://schemas.microsoft.com/office/word/2010/wordprocessingShape" mc:Ignorable="w14 w15 w16se w16cid w16 w16cex w16sdtdh w16du wp14">
   <w:body>
     <w:p>
       <w:r>
@@ -17,9 +17,29 @@
           <w:ilvl w:val="0"/>
           <w:numId w:val="4"/>
         </w:numPr>
-      </w:pPr>
-      <w:r>
-        <w:t>Create a new class called Objective to hold the objective data and tallies.</w:t>
+        <w:rPr>
+          <w:strike/>
+        </w:rPr>
+      </w:pPr>
+      <w:r>
+        <w:rPr>
+          <w:strike/>
+        </w:rPr>
+        <w:t xml:space="preserve">Create a new class called Objective to hold </w:t>
+      </w:r>
+      <w:proofErr w:type="gramStart"/>
+      <w:r>
+        <w:rPr>
+          <w:strike/>
+        </w:rPr>
+        <w:t>the objective</w:t>
+      </w:r>
+      <w:proofErr w:type="gramEnd"/>
+      <w:r>
+        <w:rPr>
+          <w:strike/>
+        </w:rPr>
+        <w:t xml:space="preserve"> data and tallies.</w:t>
       </w:r>
     </w:p>
     <w:p>
@@ -28,8 +48,14 @@
           <w:ilvl w:val="0"/>
           <w:numId w:val="4"/>
         </w:numPr>
-      </w:pPr>
-      <w:r>
+        <w:rPr>
+          <w:strike/>
+        </w:rPr>
+      </w:pPr>
+      <w:r>
+        <w:rPr>
+          <w:strike/>
+        </w:rPr>
         <w:t xml:space="preserve">Define the properties for the Objective class: </w:t>
       </w:r>
     </w:p>
@@ -39,13 +65,22 @@
           <w:ilvl w:val="1"/>
           <w:numId w:val="4"/>
         </w:numPr>
-      </w:pPr>
-      <w:proofErr w:type="spellStart"/>
-      <w:r>
+        <w:rPr>
+          <w:strike/>
+        </w:rPr>
+      </w:pPr>
+      <w:proofErr w:type="spellStart"/>
+      <w:r>
+        <w:rPr>
+          <w:strike/>
+        </w:rPr>
         <w:t>ModuleNumber</w:t>
       </w:r>
       <w:proofErr w:type="spellEnd"/>
       <w:r>
+        <w:rPr>
+          <w:strike/>
+        </w:rPr>
         <w:t xml:space="preserve"> (int)</w:t>
       </w:r>
     </w:p>
@@ -55,13 +90,22 @@
           <w:ilvl w:val="1"/>
           <w:numId w:val="4"/>
         </w:numPr>
-      </w:pPr>
-      <w:proofErr w:type="spellStart"/>
-      <w:r>
+        <w:rPr>
+          <w:strike/>
+        </w:rPr>
+      </w:pPr>
+      <w:proofErr w:type="spellStart"/>
+      <w:r>
+        <w:rPr>
+          <w:strike/>
+        </w:rPr>
         <w:t>DayNumber</w:t>
       </w:r>
       <w:proofErr w:type="spellEnd"/>
       <w:r>
+        <w:rPr>
+          <w:strike/>
+        </w:rPr>
         <w:t xml:space="preserve"> (int, optional)</w:t>
       </w:r>
     </w:p>
@@ -71,13 +115,22 @@
           <w:ilvl w:val="1"/>
           <w:numId w:val="4"/>
         </w:numPr>
-      </w:pPr>
-      <w:proofErr w:type="spellStart"/>
-      <w:r>
+        <w:rPr>
+          <w:strike/>
+        </w:rPr>
+      </w:pPr>
+      <w:proofErr w:type="spellStart"/>
+      <w:r>
+        <w:rPr>
+          <w:strike/>
+        </w:rPr>
         <w:t>ObjectiveNumber</w:t>
       </w:r>
       <w:proofErr w:type="spellEnd"/>
       <w:r>
+        <w:rPr>
+          <w:strike/>
+        </w:rPr>
         <w:t xml:space="preserve"> (int)</w:t>
       </w:r>
     </w:p>
@@ -87,13 +140,22 @@
           <w:ilvl w:val="1"/>
           <w:numId w:val="4"/>
         </w:numPr>
-      </w:pPr>
-      <w:proofErr w:type="spellStart"/>
-      <w:r>
+        <w:rPr>
+          <w:strike/>
+        </w:rPr>
+      </w:pPr>
+      <w:proofErr w:type="spellStart"/>
+      <w:r>
+        <w:rPr>
+          <w:strike/>
+        </w:rPr>
         <w:t>ObjectiveString</w:t>
       </w:r>
       <w:proofErr w:type="spellEnd"/>
       <w:r>
+        <w:rPr>
+          <w:strike/>
+        </w:rPr>
         <w:t xml:space="preserve"> (string)</w:t>
       </w:r>
     </w:p>
@@ -103,8 +165,14 @@
           <w:ilvl w:val="1"/>
           <w:numId w:val="4"/>
         </w:numPr>
-      </w:pPr>
-      <w:r>
+        <w:rPr>
+          <w:strike/>
+        </w:rPr>
+      </w:pPr>
+      <w:r>
+        <w:rPr>
+          <w:strike/>
+        </w:rPr>
         <w:t>Tallies (int)</w:t>
       </w:r>
     </w:p>
@@ -114,8 +182,14 @@
           <w:ilvl w:val="0"/>
           <w:numId w:val="4"/>
         </w:numPr>
-      </w:pPr>
-      <w:r>
+        <w:rPr>
+          <w:strike/>
+        </w:rPr>
+      </w:pPr>
+      <w:r>
+        <w:rPr>
+          <w:strike/>
+        </w:rPr>
         <w:t xml:space="preserve">Define the methods for the Objective class: </w:t>
       </w:r>
     </w:p>
@@ -125,18 +199,30 @@
           <w:ilvl w:val="1"/>
           <w:numId w:val="4"/>
         </w:numPr>
+        <w:rPr>
+          <w:strike/>
+        </w:rPr>
       </w:pPr>
       <w:proofErr w:type="spellStart"/>
       <w:proofErr w:type="gramStart"/>
       <w:r>
+        <w:rPr>
+          <w:strike/>
+        </w:rPr>
         <w:t>IncrementTally</w:t>
       </w:r>
       <w:proofErr w:type="spellEnd"/>
       <w:r>
+        <w:rPr>
+          <w:strike/>
+        </w:rPr>
         <w:t>(</w:t>
       </w:r>
       <w:proofErr w:type="gramEnd"/>
       <w:r>
+        <w:rPr>
+          <w:strike/>
+        </w:rPr>
         <w:t>) (increments the tallies by 1)</w:t>
       </w:r>
     </w:p>
@@ -164,16 +250,28 @@
           <w:ilvl w:val="0"/>
           <w:numId w:val="5"/>
         </w:numPr>
-      </w:pPr>
-      <w:r>
+        <w:rPr>
+          <w:strike/>
+        </w:rPr>
+      </w:pPr>
+      <w:r>
+        <w:rPr>
+          <w:strike/>
+        </w:rPr>
         <w:t xml:space="preserve">Modify the </w:t>
       </w:r>
       <w:proofErr w:type="spellStart"/>
       <w:r>
+        <w:rPr>
+          <w:strike/>
+        </w:rPr>
         <w:t>ConfigLoader</w:t>
       </w:r>
       <w:proofErr w:type="spellEnd"/>
       <w:r>
+        <w:rPr>
+          <w:strike/>
+        </w:rPr>
         <w:t xml:space="preserve"> class to create an array of Objective objects.</w:t>
       </w:r>
     </w:p>
@@ -183,8 +281,14 @@
           <w:ilvl w:val="0"/>
           <w:numId w:val="5"/>
         </w:numPr>
-      </w:pPr>
-      <w:r>
+        <w:rPr>
+          <w:strike/>
+        </w:rPr>
+      </w:pPr>
+      <w:r>
+        <w:rPr>
+          <w:strike/>
+        </w:rPr>
         <w:t>Define a data structure (e.g. hash table or dictionary) to store the Objective objects, where the keys are the objective numbers and/or day numbers.</w:t>
       </w:r>
     </w:p>
@@ -194,16 +298,28 @@
           <w:ilvl w:val="0"/>
           <w:numId w:val="5"/>
         </w:numPr>
-      </w:pPr>
-      <w:r>
+        <w:rPr>
+          <w:strike/>
+        </w:rPr>
+      </w:pPr>
+      <w:r>
+        <w:rPr>
+          <w:strike/>
+        </w:rPr>
         <w:t xml:space="preserve">Update the </w:t>
       </w:r>
       <w:proofErr w:type="spellStart"/>
       <w:r>
+        <w:rPr>
+          <w:strike/>
+        </w:rPr>
         <w:t>ConfigLoader</w:t>
       </w:r>
       <w:proofErr w:type="spellEnd"/>
       <w:r>
+        <w:rPr>
+          <w:strike/>
+        </w:rPr>
         <w:t xml:space="preserve"> class to populate the data structure with the Objective objects.</w:t>
       </w:r>
     </w:p>
@@ -238,16 +354,28 @@
           <w:ilvl w:val="0"/>
           <w:numId w:val="6"/>
         </w:numPr>
-      </w:pPr>
-      <w:r>
+        <w:rPr>
+          <w:strike/>
+        </w:rPr>
+      </w:pPr>
+      <w:r>
+        <w:rPr>
+          <w:strike/>
+        </w:rPr>
         <w:t>Modify the Get-</w:t>
       </w:r>
       <w:proofErr w:type="spellStart"/>
       <w:r>
+        <w:rPr>
+          <w:strike/>
+        </w:rPr>
         <w:t>QuestionObjective</w:t>
       </w:r>
       <w:proofErr w:type="spellEnd"/>
       <w:r>
+        <w:rPr>
+          <w:strike/>
+        </w:rPr>
         <w:t xml:space="preserve"> function to return a hash table with the objective number and/or day number as keys.</w:t>
       </w:r>
     </w:p>
@@ -257,16 +385,28 @@
           <w:ilvl w:val="0"/>
           <w:numId w:val="6"/>
         </w:numPr>
-      </w:pPr>
-      <w:r>
+        <w:rPr>
+          <w:strike/>
+        </w:rPr>
+      </w:pPr>
+      <w:r>
+        <w:rPr>
+          <w:strike/>
+        </w:rPr>
         <w:t xml:space="preserve">Update the function to use the Objective class and data structure created by the </w:t>
       </w:r>
       <w:proofErr w:type="spellStart"/>
       <w:r>
+        <w:rPr>
+          <w:strike/>
+        </w:rPr>
         <w:t>ConfigLoader</w:t>
       </w:r>
       <w:proofErr w:type="spellEnd"/>
       <w:r>
+        <w:rPr>
+          <w:strike/>
+        </w:rPr>
         <w:t xml:space="preserve"> class.</w:t>
       </w:r>
     </w:p>
@@ -301,16 +441,28 @@
           <w:ilvl w:val="0"/>
           <w:numId w:val="7"/>
         </w:numPr>
-      </w:pPr>
-      <w:r>
+        <w:rPr>
+          <w:strike/>
+        </w:rPr>
+      </w:pPr>
+      <w:r>
+        <w:rPr>
+          <w:strike/>
+        </w:rPr>
         <w:t>Modify the New-</w:t>
       </w:r>
       <w:proofErr w:type="spellStart"/>
       <w:r>
+        <w:rPr>
+          <w:strike/>
+        </w:rPr>
         <w:t>TestResults</w:t>
       </w:r>
       <w:proofErr w:type="spellEnd"/>
       <w:r>
+        <w:rPr>
+          <w:strike/>
+        </w:rPr>
         <w:t xml:space="preserve"> function to reference the Objective objects by looking them up in the data structure.</w:t>
       </w:r>
     </w:p>
@@ -322,7 +474,24 @@
         </w:numPr>
       </w:pPr>
       <w:r>
-        <w:t>Update the function to increment the tallies of the Objective objects accordingly.</w:t>
+        <w:rPr>
+          <w:strike/>
+        </w:rPr>
+        <w:t xml:space="preserve">Update the function to </w:t>
+      </w:r>
+      <w:proofErr w:type="gramStart"/>
+      <w:r>
+        <w:rPr>
+          <w:strike/>
+        </w:rPr>
+        <w:t>increment</w:t>
+      </w:r>
+      <w:proofErr w:type="gramEnd"/>
+      <w:r>
+        <w:rPr>
+          <w:strike/>
+        </w:rPr>
+        <w:t xml:space="preserve"> the tallies of the Objective objects accordingly.</w:t>
       </w:r>
     </w:p>
     <w:p>
@@ -340,8 +509,14 @@
           <w:ilvl w:val="0"/>
           <w:numId w:val="8"/>
         </w:numPr>
-      </w:pPr>
-      <w:r>
+        <w:rPr>
+          <w:strike/>
+        </w:rPr>
+      </w:pPr>
+      <w:r>
+        <w:rPr>
+          <w:strike/>
+        </w:rPr>
         <w:t>Define the configuration file format for daily objectives using the &lt;DAYBREAK&gt; tags.</w:t>
       </w:r>
     </w:p>
@@ -351,8 +526,14 @@
           <w:ilvl w:val="0"/>
           <w:numId w:val="8"/>
         </w:numPr>
-      </w:pPr>
-      <w:r>
+        <w:rPr>
+          <w:strike/>
+        </w:rPr>
+      </w:pPr>
+      <w:r>
+        <w:rPr>
+          <w:strike/>
+        </w:rPr>
         <w:t>Update the configuration file format to include the objective strings and tallies.</w:t>
       </w:r>
     </w:p>
@@ -371,8 +552,14 @@
           <w:ilvl w:val="0"/>
           <w:numId w:val="9"/>
         </w:numPr>
-      </w:pPr>
-      <w:r>
+        <w:rPr>
+          <w:strike/>
+        </w:rPr>
+      </w:pPr>
+      <w:r>
+        <w:rPr>
+          <w:strike/>
+        </w:rPr>
         <w:t>Provide clear documentation and examples for the configuration file format.</w:t>
       </w:r>
     </w:p>
@@ -382,8 +569,14 @@
           <w:ilvl w:val="0"/>
           <w:numId w:val="9"/>
         </w:numPr>
-      </w:pPr>
-      <w:r>
+        <w:rPr>
+          <w:strike/>
+        </w:rPr>
+      </w:pPr>
+      <w:r>
+        <w:rPr>
+          <w:strike/>
+        </w:rPr>
         <w:t>Consider providing validation or error checking for the configuration files.</w:t>
       </w:r>
     </w:p>
@@ -393,8 +586,14 @@
           <w:ilvl w:val="0"/>
           <w:numId w:val="9"/>
         </w:numPr>
-      </w:pPr>
-      <w:r>
+        <w:rPr>
+          <w:strike/>
+        </w:rPr>
+      </w:pPr>
+      <w:r>
+        <w:rPr>
+          <w:strike/>
+        </w:rPr>
         <w:lastRenderedPageBreak/>
         <w:t>Ensure that the user interface is simple and intuitive.</w:t>
       </w:r>
@@ -414,8 +613,14 @@
           <w:ilvl w:val="0"/>
           <w:numId w:val="10"/>
         </w:numPr>
-      </w:pPr>
-      <w:r>
+        <w:rPr>
+          <w:strike/>
+        </w:rPr>
+      </w:pPr>
+      <w:r>
+        <w:rPr>
+          <w:strike/>
+        </w:rPr>
         <w:t>Test the new design to ensure that it works correctly.</w:t>
       </w:r>
     </w:p>
@@ -425,8 +630,14 @@
           <w:ilvl w:val="0"/>
           <w:numId w:val="10"/>
         </w:numPr>
-      </w:pPr>
-      <w:r>
+        <w:rPr>
+          <w:strike/>
+        </w:rPr>
+      </w:pPr>
+      <w:r>
+        <w:rPr>
+          <w:strike/>
+        </w:rPr>
         <w:t>Validate the configuration files to ensure that they are correctly formatted and contain the necessary information.</w:t>
       </w:r>
     </w:p>
@@ -930,7 +1141,7 @@
 </file>
 
 <file path=word/numbering.xml><?xml version="1.0" encoding="utf-8"?>
-<w:numbering xmlns:wpc="http://schemas.microsoft.com/office/word/2010/wordprocessingCanvas" xmlns:cx="http://schemas.microsoft.com/office/drawing/2014/chartex" xmlns:cx1="http://schemas.microsoft.com/office/drawing/2015/9/8/chartex" xmlns:cx2="http://schemas.microsoft.com/office/drawing/2015/10/21/chartex" xmlns:cx3="http://schemas.microsoft.com/office/drawing/2016/5/9/chartex" xmlns:cx4="http://schemas.microsoft.com/office/drawing/2016/5/10/chartex" xmlns:cx5="http://schemas.microsoft.com/office/drawing/2016/5/11/chartex" xmlns:cx6="http://schemas.microsoft.com/office/drawing/2016/5/12/chartex" xmlns:cx7="http://schemas.microsoft.com/office/drawing/2016/5/13/chartex" xmlns:cx8="http://schemas.microsoft.com/office/drawing/2016/5/14/chartex" xmlns:mc="http://schemas.openxmlformats.org/markup-compatibility/2006" xmlns:aink="http://schemas.microsoft.com/office/drawing/2016/ink" xmlns:am3d="http://schemas.microsoft.com/office/drawing/2017/model3d" xmlns:o="urn:schemas-microsoft-com:office:office" xmlns:oel="http://schemas.microsoft.com/office/2019/extlst" xmlns:r="http://schemas.openxmlformats.org/officeDocument/2006/relationships" xmlns:m="http://schemas.openxmlformats.org/officeDocument/2006/math" xmlns:v="urn:schemas-microsoft-com:vml" xmlns:wp14="http://schemas.microsoft.com/office/word/2010/wordprocessingDrawing" xmlns:wp="http://schemas.openxmlformats.org/drawingml/2006/wordprocessingDrawing" xmlns:w10="urn:schemas-microsoft-com:office:word" xmlns:w="http://schemas.openxmlformats.org/wordprocessingml/2006/main" xmlns:w14="http://schemas.microsoft.com/office/word/2010/wordml" xmlns:w15="http://schemas.microsoft.com/office/word/2012/wordml" xmlns:w16cex="http://schemas.microsoft.com/office/word/2018/wordml/cex" xmlns:w16cid="http://schemas.microsoft.com/office/word/2016/wordml/cid" xmlns:w16="http://schemas.microsoft.com/office/word/2018/wordml" xmlns:w16sdtdh="http://schemas.microsoft.com/office/word/2020/wordml/sdtdatahash" xmlns:w16se="http://schemas.microsoft.com/office/word/2015/wordml/symex" xmlns:wpg="http://schemas.microsoft.com/office/word/2010/wordprocessingGroup" xmlns:wpi="http://schemas.microsoft.com/office/word/2010/wordprocessingInk" xmlns:wne="http://schemas.microsoft.com/office/word/2006/wordml" xmlns:wps="http://schemas.microsoft.com/office/word/2010/wordprocessingShape" mc:Ignorable="w14 w15 w16se w16cid w16 w16cex w16sdtdh wp14">
+<w:numbering xmlns:wpc="http://schemas.microsoft.com/office/word/2010/wordprocessingCanvas" xmlns:cx="http://schemas.microsoft.com/office/drawing/2014/chartex" xmlns:cx1="http://schemas.microsoft.com/office/drawing/2015/9/8/chartex" xmlns:cx2="http://schemas.microsoft.com/office/drawing/2015/10/21/chartex" xmlns:cx3="http://schemas.microsoft.com/office/drawing/2016/5/9/chartex" xmlns:cx4="http://schemas.microsoft.com/office/drawing/2016/5/10/chartex" xmlns:cx5="http://schemas.microsoft.com/office/drawing/2016/5/11/chartex" xmlns:cx6="http://schemas.microsoft.com/office/drawing/2016/5/12/chartex" xmlns:cx7="http://schemas.microsoft.com/office/drawing/2016/5/13/chartex" xmlns:cx8="http://schemas.microsoft.com/office/drawing/2016/5/14/chartex" xmlns:mc="http://schemas.openxmlformats.org/markup-compatibility/2006" xmlns:aink="http://schemas.microsoft.com/office/drawing/2016/ink" xmlns:am3d="http://schemas.microsoft.com/office/drawing/2017/model3d" xmlns:o="urn:schemas-microsoft-com:office:office" xmlns:oel="http://schemas.microsoft.com/office/2019/extlst" xmlns:r="http://schemas.openxmlformats.org/officeDocument/2006/relationships" xmlns:m="http://schemas.openxmlformats.org/officeDocument/2006/math" xmlns:v="urn:schemas-microsoft-com:vml" xmlns:wp14="http://schemas.microsoft.com/office/word/2010/wordprocessingDrawing" xmlns:wp="http://schemas.openxmlformats.org/drawingml/2006/wordprocessingDrawing" xmlns:w10="urn:schemas-microsoft-com:office:word" xmlns:w="http://schemas.openxmlformats.org/wordprocessingml/2006/main" xmlns:w14="http://schemas.microsoft.com/office/word/2010/wordml" xmlns:w15="http://schemas.microsoft.com/office/word/2012/wordml" xmlns:w16cex="http://schemas.microsoft.com/office/word/2018/wordml/cex" xmlns:w16cid="http://schemas.microsoft.com/office/word/2016/wordml/cid" xmlns:w16="http://schemas.microsoft.com/office/word/2018/wordml" xmlns:w16du="http://schemas.microsoft.com/office/word/2023/wordml/word16du" xmlns:w16sdtdh="http://schemas.microsoft.com/office/word/2020/wordml/sdtdatahash" xmlns:w16se="http://schemas.microsoft.com/office/word/2015/wordml/symex" xmlns:wpg="http://schemas.microsoft.com/office/word/2010/wordprocessingGroup" xmlns:wpi="http://schemas.microsoft.com/office/word/2010/wordprocessingInk" xmlns:wne="http://schemas.microsoft.com/office/word/2006/wordml" xmlns:wps="http://schemas.microsoft.com/office/word/2010/wordprocessingShape" mc:Ignorable="w14 w15 w16se w16cid w16 w16cex w16sdtdh w16du wp14">
   <w:abstractNum w:abstractNumId="0" w15:restartNumberingAfterBreak="0">
     <w:nsid w:val="031852E8"/>
     <w:multiLevelType w:val="multilevel"/>
@@ -2099,7 +2310,7 @@
 </file>
 
 <file path=word/styles.xml><?xml version="1.0" encoding="utf-8"?>
-<w:styles xmlns:mc="http://schemas.openxmlformats.org/markup-compatibility/2006" xmlns:r="http://schemas.openxmlformats.org/officeDocument/2006/relationships" xmlns:w="http://schemas.openxmlformats.org/wordprocessingml/2006/main" xmlns:w14="http://schemas.microsoft.com/office/word/2010/wordml" xmlns:w15="http://schemas.microsoft.com/office/word/2012/wordml" xmlns:w16cex="http://schemas.microsoft.com/office/word/2018/wordml/cex" xmlns:w16cid="http://schemas.microsoft.com/office/word/2016/wordml/cid" xmlns:w16="http://schemas.microsoft.com/office/word/2018/wordml" xmlns:w16sdtdh="http://schemas.microsoft.com/office/word/2020/wordml/sdtdatahash" xmlns:w16se="http://schemas.microsoft.com/office/word/2015/wordml/symex" mc:Ignorable="w14 w15 w16se w16cid w16 w16cex w16sdtdh">
+<w:styles xmlns:mc="http://schemas.openxmlformats.org/markup-compatibility/2006" xmlns:r="http://schemas.openxmlformats.org/officeDocument/2006/relationships" xmlns:w="http://schemas.openxmlformats.org/wordprocessingml/2006/main" xmlns:w14="http://schemas.microsoft.com/office/word/2010/wordml" xmlns:w15="http://schemas.microsoft.com/office/word/2012/wordml" xmlns:w16cex="http://schemas.microsoft.com/office/word/2018/wordml/cex" xmlns:w16cid="http://schemas.microsoft.com/office/word/2016/wordml/cid" xmlns:w16="http://schemas.microsoft.com/office/word/2018/wordml" xmlns:w16du="http://schemas.microsoft.com/office/word/2023/wordml/word16du" xmlns:w16sdtdh="http://schemas.microsoft.com/office/word/2020/wordml/sdtdatahash" xmlns:w16se="http://schemas.microsoft.com/office/word/2015/wordml/symex" mc:Ignorable="w14 w15 w16se w16cid w16 w16cex w16sdtdh w16du">
   <w:docDefaults>
     <w:rPrDefault>
       <w:rPr>
@@ -2502,6 +2713,7 @@
   <w:style w:type="character" w:default="1" w:styleId="DefaultParagraphFont">
     <w:name w:val="Default Paragraph Font"/>
     <w:uiPriority w:val="1"/>
+    <w:semiHidden/>
     <w:unhideWhenUsed/>
   </w:style>
   <w:style w:type="table" w:default="1" w:styleId="TableNormal">

</xml_diff>